<commit_message>
docs: clarify greenfield development scope
</commit_message>
<xml_diff>
--- a/众肯科技项目全过程管理系统需求说明书_V2.2_CloudBase部署版.docx
+++ b/众肯科技项目全过程管理系统需求说明书_V2.2_CloudBase部署版.docx
@@ -559,10 +559,7 @@
     </w:p>
     <w:p>
       <w:r>
-        <w:rPr>
-          <w:rFonts w:ascii="Calibri" w:hAnsi="Calibri" w:eastAsia="Microsoft YaHei"/>
-        </w:rPr>
-        <w:t>本 V2.2 文档是当前唯一有效的正式开发与验收需求基线。V2.1 与《众肯管理系统需求模块》保留为需求溯源材料；若其内容与本文件不一致，以本文件为准。后续新增或调整范围必须进入变更清单，并评估数据库、接口、权限、测试和交付影响。</w:t>
+        <w:t>本项目为完整的新建系统，所有程序、数据库结构、接口和前端页面均从零开发；不包含旧系统改造、旧程序复用、旧接口兼容或历史数据迁移。本 V2.2 文档是当前唯一有效的正式开发与验收需求基线。</w:t>
       </w:r>
     </w:p>
     <w:p>

</xml_diff>

<commit_message>
docs: sync Word requirement baseline
</commit_message>
<xml_diff>
--- a/众肯科技项目全过程管理系统需求说明书_V2.2_CloudBase部署版.docx
+++ b/众肯科技项目全过程管理系统需求说明书_V2.2_CloudBase部署版.docx
@@ -9345,7 +9345,7 @@
         <w:rPr>
           <w:rFonts w:ascii="Calibri" w:hAnsi="Calibri" w:eastAsia="Microsoft YaHei"/>
         </w:rPr>
-        <w:t>：字典、编号规则、参数、消息、通知模板、审计日志、迁移版本。</w:t>
+        <w:t>：字典、编号规则、参数、消息、通知模板、审计日志。</w:t>
       </w:r>
     </w:p>
     <w:p>
@@ -9396,7 +9396,7 @@
           <w:color w:val="1F4D78"/>
           <w:sz w:val="19"/>
         </w:rPr>
-        <w:t>pm_*</w:t>
+        <w:t>prj_*</w:t>
       </w:r>
       <w:r>
         <w:rPr>
@@ -9434,7 +9434,7 @@
           <w:color w:val="1F4D78"/>
           <w:sz w:val="19"/>
         </w:rPr>
-        <w:t>contract_*</w:t>
+        <w:t>con_*</w:t>
       </w:r>
       <w:r>
         <w:rPr>
@@ -9459,7 +9459,7 @@
         <w:rPr>
           <w:rFonts w:ascii="Calibri" w:hAnsi="Calibri" w:eastAsia="Microsoft YaHei"/>
         </w:rPr>
-        <w:t>：开票申请、销项发票、收款、报销、付款申请、实际付款、保证金。</w:t>
+        <w:t>：开票申请、销项发票、收款、报销、付款申请、实际付款、保证金、日常采购。</w:t>
       </w:r>
     </w:p>
     <w:p>
@@ -9479,25 +9479,6 @@
           <w:rFonts w:ascii="Calibri" w:hAnsi="Calibri" w:eastAsia="Microsoft YaHei"/>
         </w:rPr>
         <w:t>：合作分配方案、合作方结算。</w:t>
-      </w:r>
-    </w:p>
-    <w:p>
-      <w:pPr>
-        <w:pStyle w:val="ListBullet"/>
-      </w:pPr>
-      <w:r>
-        <w:rPr>
-          <w:rFonts w:ascii="Calibri" w:hAnsi="Calibri" w:eastAsia="Consolas"/>
-          <w:color w:val="1F4D78"/>
-          <w:sz w:val="19"/>
-        </w:rPr>
-        <w:t>purchase_*</w:t>
-      </w:r>
-      <w:r>
-        <w:rPr>
-          <w:rFonts w:ascii="Calibri" w:hAnsi="Calibri" w:eastAsia="Microsoft YaHei"/>
-        </w:rPr>
-        <w:t>：日常采购。</w:t>
       </w:r>
     </w:p>
     <w:p>
@@ -10587,7 +10568,7 @@
         <w:rPr>
           <w:rFonts w:ascii="Calibri" w:hAnsi="Calibri" w:eastAsia="Microsoft YaHei"/>
         </w:rPr>
-        <w:t>P0 关系表逐字段定义如下，其余业务表在迁移脚本前按相同格式展开并接受字段审计：</w:t>
+        <w:t>P0 关系表逐字段定义如下，其余业务表在初始化建表脚本定稿前按相同格式展开并接受字段审计：</w:t>
       </w:r>
     </w:p>
     <w:tbl>
@@ -13665,7 +13646,7 @@
         <w:rPr>
           <w:rFonts w:ascii="Calibri" w:hAnsi="Calibri" w:eastAsia="Microsoft YaHei"/>
         </w:rPr>
-        <w:t>。完整字段字典将作为版本化数据库设计文件，与首个迁移脚本同步交付并自动校验金额类型、索引和非空约束。</w:t>
+        <w:t>。完整字段字典将作为版本化数据库设计文件，与初始化建表脚本同步交付并自动校验金额类型、索引和非空约束。</w:t>
       </w:r>
     </w:p>
     <w:p>

</xml_diff>